<commit_message>
docs: normaliza vocabulario e glossarios dos catalogos semanticos
</commit_message>
<xml_diff>
--- a/01_Logica_e_Raciocinio/01_Catalogo_Semantico.docx
+++ b/01_Logica_e_Raciocinio/01_Catalogo_Semantico.docx
@@ -126,10 +126,10 @@
         <w:rPr>
           <w:b/>
         </w:rPr>
-        <w:t xml:space="preserve">Palavras-chave: </w:t>
+        <w:t xml:space="preserve">Palavras-chave:</w:t>
       </w:r>
       <w:r>
-        <w:t>tabela-verdade, negação, conjunção, disjunção, proposição lógica, valor lógico</w:t>
+        <w:t xml:space="preserve"> tabela-verdade, negação lógica, AND lógico, OR lógico, proposição lógica, valor lógico</w:t>
       </w:r>
     </w:p>
     <w:p>
@@ -230,10 +230,10 @@
         <w:rPr>
           <w:b/>
         </w:rPr>
-        <w:t xml:space="preserve">Palavras-chave: </w:t>
+        <w:t xml:space="preserve">Palavras-chave:</w:t>
       </w:r>
       <w:r>
-        <w:t>negação, valor lógico, proposição lógica</w:t>
+        <w:t xml:space="preserve"> negação lógica, valor lógico, proposição lógica</w:t>
       </w:r>
     </w:p>
     <w:p>
@@ -282,10 +282,10 @@
         <w:rPr>
           <w:b/>
         </w:rPr>
-        <w:t xml:space="preserve">Palavras-chave: </w:t>
+        <w:t xml:space="preserve">Palavras-chave:</w:t>
       </w:r>
       <w:r>
-        <w:t>conjunção, valor lógico, combinação de valores</w:t>
+        <w:t xml:space="preserve"> AND lógico, valor lógico, combinação de valores</w:t>
       </w:r>
     </w:p>
     <w:p>
@@ -334,10 +334,10 @@
         <w:rPr>
           <w:b/>
         </w:rPr>
-        <w:t xml:space="preserve">Palavras-chave: </w:t>
+        <w:t xml:space="preserve">Palavras-chave:</w:t>
       </w:r>
       <w:r>
-        <w:t>disjunção, valor lógico, combinação de valores</w:t>
+        <w:t xml:space="preserve"> OR lógico, valor lógico, combinação de valores</w:t>
       </w:r>
     </w:p>
     <w:p>
@@ -542,10 +542,10 @@
         <w:rPr>
           <w:b/>
         </w:rPr>
-        <w:t xml:space="preserve">Palavras-chave: </w:t>
+        <w:t xml:space="preserve">Palavras-chave:</w:t>
       </w:r>
       <w:r>
-        <w:t>conjunção, proposição lógica, tabela-verdade, expressão lógica, condição</w:t>
+        <w:t xml:space="preserve"> AND lógico, proposição lógica, tabela-verdade, expressão lógica, condição</w:t>
       </w:r>
     </w:p>
     <w:p>
@@ -594,10 +594,10 @@
         <w:rPr>
           <w:b/>
         </w:rPr>
-        <w:t xml:space="preserve">Palavras-chave: </w:t>
+        <w:t xml:space="preserve">Palavras-chave:</w:t>
       </w:r>
       <w:r>
-        <w:t>negação, conjunção, disjunção, tabela-verdade, expressão lógica</w:t>
+        <w:t xml:space="preserve"> negação lógica, AND lógico, OR lógico, tabela-verdade, expressão lógica</w:t>
       </w:r>
     </w:p>
     <w:p>
@@ -646,10 +646,10 @@
         <w:rPr>
           <w:b/>
         </w:rPr>
-        <w:t xml:space="preserve">Palavras-chave: </w:t>
+        <w:t xml:space="preserve">Palavras-chave:</w:t>
       </w:r>
       <w:r>
-        <w:t>negação, disjunção, expressão lógica, tabela-verdade, tomada de decisão</w:t>
+        <w:t xml:space="preserve"> negação lógica, OR lógico, expressão lógica, tabela-verdade, tomada de decisão</w:t>
       </w:r>
     </w:p>
     <w:p>
@@ -698,10 +698,10 @@
         <w:rPr>
           <w:b/>
         </w:rPr>
-        <w:t xml:space="preserve">Palavras-chave: </w:t>
+        <w:t xml:space="preserve">Palavras-chave:</w:t>
       </w:r>
       <w:r>
-        <w:t>exercício didático, proposição lógica, conjunção, disjunção, tabela-verdade, condição</w:t>
+        <w:t xml:space="preserve"> exercício, proposição lógica, AND lógico, OR lógico, tabela-verdade, condição</w:t>
       </w:r>
     </w:p>
     <w:p>
@@ -750,10 +750,10 @@
         <w:rPr>
           <w:b/>
         </w:rPr>
-        <w:t xml:space="preserve">Palavras-chave: </w:t>
+        <w:t xml:space="preserve">Palavras-chave:</w:t>
       </w:r>
       <w:r>
-        <w:t>gabarito, proposição lógica, conjunção, disjunção, tabela-verdade, condição</w:t>
+        <w:t xml:space="preserve"> gabarito, proposição lógica, AND lógico, OR lógico, tabela-verdade, condição</w:t>
       </w:r>
     </w:p>
     <w:p>
@@ -779,7 +779,53 @@
         <w:rPr>
           <w:b/>
         </w:rPr>
-        <w:t>combinação de valores</w:t>
+        <w:t xml:space="preserve">AND lógico</w:t>
+      </w:r>
+      <w:r>
+        <w:t xml:space="preserve"> — Operação AND, verdadeira apenas quando ambas as entradas são verdadeiras.</w:t>
+      </w:r>
+    </w:p>
+    <w:p>
+      <w:pPr/>
+      <w:r>
+        <w:rPr>
+          <w:b/>
+        </w:rPr>
+        <w:t xml:space="preserve">Materiais:</w:t>
+      </w:r>
+      <w:r>
+        <w:t xml:space="preserve"> exercicio.md; gabarito.md; logica_booleana2.png; p_and_q.gif; problemas_condicoes3.png; problemas_condicoes4.png</w:t>
+      </w:r>
+    </w:p>
+    <w:p>
+      <w:r>
+        <w:rPr>
+          <w:b/>
+        </w:rPr>
+        <w:t xml:space="preserve">árvore de possibilidades</w:t>
+      </w:r>
+      <w:r>
+        <w:t xml:space="preserve"> — Representação ramificada das alternativas de valores de entrada.</w:t>
+      </w:r>
+    </w:p>
+    <w:p>
+      <w:pPr/>
+      <w:r>
+        <w:rPr>
+          <w:b/>
+        </w:rPr>
+        <w:t xml:space="preserve">Materiais:</w:t>
+      </w:r>
+      <w:r>
+        <w:t xml:space="preserve"> logica_booleana3.png</w:t>
+      </w:r>
+    </w:p>
+    <w:p>
+      <w:r>
+        <w:rPr>
+          <w:b/>
+        </w:rPr>
+        <w:t xml:space="preserve">combinação de valores</w:t>
       </w:r>
       <w:r>
         <w:t xml:space="preserve"> — Atribuição específica de valores às proposições de entrada.</w:t>
@@ -791,10 +837,10 @@
         <w:rPr>
           <w:b/>
         </w:rPr>
-        <w:t xml:space="preserve">Materiais: </w:t>
+        <w:t xml:space="preserve">Materiais:</w:t>
       </w:r>
       <w:r>
-        <w:t>logica_booleana3.png; p_and_q.gif; p_or_q.gif; p_xor_q.gif; problema_condicoes.png</w:t>
+        <w:t xml:space="preserve"> logica_booleana3.png; p_and_q.gif; p_or_q.gif; p_xor_q.gif; problema_condicoes.png</w:t>
       </w:r>
     </w:p>
     <w:p>
@@ -802,7 +848,7 @@
         <w:rPr>
           <w:b/>
         </w:rPr>
-        <w:t>condição</w:t>
+        <w:t xml:space="preserve">condição</w:t>
       </w:r>
       <w:r>
         <w:t xml:space="preserve"> — Fato ou requisito considerado para avaliar uma decisão ou expressão.</w:t>
@@ -814,10 +860,10 @@
         <w:rPr>
           <w:b/>
         </w:rPr>
-        <w:t xml:space="preserve">Materiais: </w:t>
+        <w:t xml:space="preserve">Materiais:</w:t>
       </w:r>
       <w:r>
-        <w:t>problema_condicoes.png; problemas_condicoes2.png; problemas_condicoes3.png; exercicio.md; gabarito.md</w:t>
+        <w:t xml:space="preserve"> exercicio.md; gabarito.md; problema_condicoes.png; problemas_condicoes2.png; problemas_condicoes3.png</w:t>
       </w:r>
     </w:p>
     <w:p>
@@ -825,7 +871,7 @@
         <w:rPr>
           <w:b/>
         </w:rPr>
-        <w:t>conectivo lógico</w:t>
+        <w:t xml:space="preserve">conectivo lógico</w:t>
       </w:r>
       <w:r>
         <w:t xml:space="preserve"> — Operador que transforma ou combina proposições.</w:t>
@@ -837,10 +883,10 @@
         <w:rPr>
           <w:b/>
         </w:rPr>
-        <w:t xml:space="preserve">Materiais: </w:t>
+        <w:t xml:space="preserve">Materiais:</w:t>
       </w:r>
       <w:r>
-        <w:t>logica_booleana.png</w:t>
+        <w:t xml:space="preserve"> logica_booleana.png</w:t>
       </w:r>
     </w:p>
     <w:p>
@@ -848,10 +894,10 @@
         <w:rPr>
           <w:b/>
         </w:rPr>
-        <w:t>conjunção</w:t>
+        <w:t xml:space="preserve">disjunção exclusiva</w:t>
       </w:r>
       <w:r>
-        <w:t xml:space="preserve"> — Operação AND, verdadeira apenas quando ambas as entradas são verdadeiras.</w:t>
+        <w:t xml:space="preserve"> — Operação XOR, verdadeira quando duas entradas têm valores diferentes.</w:t>
       </w:r>
     </w:p>
     <w:p>
@@ -860,10 +906,10 @@
         <w:rPr>
           <w:b/>
         </w:rPr>
-        <w:t xml:space="preserve">Materiais: </w:t>
+        <w:t xml:space="preserve">Materiais:</w:t>
       </w:r>
       <w:r>
-        <w:t>logica_booleana2.png; p_and_q.gif; problemas_condicoes3.png; problemas_condicoes4.png; exercicio.md; gabarito.md</w:t>
+        <w:t xml:space="preserve"> p_xor_q.gif</w:t>
       </w:r>
     </w:p>
     <w:p>
@@ -871,7 +917,122 @@
         <w:rPr>
           <w:b/>
         </w:rPr>
-        <w:t>disjunção</w:t>
+        <w:t xml:space="preserve">exercício</w:t>
+      </w:r>
+      <w:r>
+        <w:t xml:space="preserve"> — Atividade proposta para aplicar e verificar conceitos do capítulo.</w:t>
+      </w:r>
+    </w:p>
+    <w:p>
+      <w:pPr/>
+      <w:r>
+        <w:rPr>
+          <w:b/>
+        </w:rPr>
+        <w:t xml:space="preserve">Materiais:</w:t>
+      </w:r>
+      <w:r>
+        <w:t xml:space="preserve"> exercicio.md</w:t>
+      </w:r>
+    </w:p>
+    <w:p>
+      <w:r>
+        <w:rPr>
+          <w:b/>
+        </w:rPr>
+        <w:t xml:space="preserve">expressão lógica</w:t>
+      </w:r>
+      <w:r>
+        <w:t xml:space="preserve"> — Composição de proposições e conectivos que produz um valor lógico.</w:t>
+      </w:r>
+    </w:p>
+    <w:p>
+      <w:pPr/>
+      <w:r>
+        <w:rPr>
+          <w:b/>
+        </w:rPr>
+        <w:t xml:space="preserve">Materiais:</w:t>
+      </w:r>
+      <w:r>
+        <w:t xml:space="preserve"> problemas_condicoes3.png; problemas_condicoes4.png; problemas_condicoes5.png</w:t>
+      </w:r>
+    </w:p>
+    <w:p>
+      <w:r>
+        <w:rPr>
+          <w:b/>
+        </w:rPr>
+        <w:t xml:space="preserve">gabarito</w:t>
+      </w:r>
+      <w:r>
+        <w:t xml:space="preserve"> — Resolução e justificativa das respostas de um exercício.</w:t>
+      </w:r>
+    </w:p>
+    <w:p>
+      <w:pPr/>
+      <w:r>
+        <w:rPr>
+          <w:b/>
+        </w:rPr>
+        <w:t xml:space="preserve">Materiais:</w:t>
+      </w:r>
+      <w:r>
+        <w:t xml:space="preserve"> gabarito.md</w:t>
+      </w:r>
+    </w:p>
+    <w:p>
+      <w:r>
+        <w:rPr>
+          <w:b/>
+        </w:rPr>
+        <w:t xml:space="preserve">lógica booleana</w:t>
+      </w:r>
+      <w:r>
+        <w:t xml:space="preserve"> — Sistema de raciocínio baseado em valores verdadeiro e falso e operações lógicas.</w:t>
+      </w:r>
+    </w:p>
+    <w:p>
+      <w:pPr/>
+      <w:r>
+        <w:rPr>
+          <w:b/>
+        </w:rPr>
+        <w:t xml:space="preserve">Materiais:</w:t>
+      </w:r>
+      <w:r>
+        <w:t xml:space="preserve"> logica_booleana.png</w:t>
+      </w:r>
+    </w:p>
+    <w:p>
+      <w:r>
+        <w:rPr>
+          <w:b/>
+        </w:rPr>
+        <w:t xml:space="preserve">negação lógica</w:t>
+      </w:r>
+      <w:r>
+        <w:t xml:space="preserve"> — Operação NOT que inverte o valor lógico de uma proposição.</w:t>
+      </w:r>
+    </w:p>
+    <w:p>
+      <w:pPr/>
+      <w:r>
+        <w:rPr>
+          <w:b/>
+        </w:rPr>
+        <w:t xml:space="preserve">Materiais:</w:t>
+      </w:r>
+      <w:r>
+        <w:t xml:space="preserve"> logica_booleana2.png; not_p.gif; problemas_condicoes4.png; problemas_condicoes5.png</w:t>
+      </w:r>
+    </w:p>
+    <w:p>
+      <w:r>
+        <w:rPr>
+          <w:b/>
+        </w:rPr>
+        <w:t xml:space="preserve">OR lógico</w:t>
       </w:r>
       <w:r>
         <w:t xml:space="preserve"> — Operação OR inclusiva, verdadeira quando ao menos uma entrada é verdadeira.</w:t>
@@ -883,10 +1044,10 @@
         <w:rPr>
           <w:b/>
         </w:rPr>
-        <w:t xml:space="preserve">Materiais: </w:t>
+        <w:t xml:space="preserve">Materiais:</w:t>
       </w:r>
       <w:r>
-        <w:t>logica_booleana2.png; p_or_q.gif; problemas_condicoes4.png; problemas_condicoes5.png; exercicio.md; gabarito.md</w:t>
+        <w:t xml:space="preserve"> exercicio.md; gabarito.md; logica_booleana2.png; p_or_q.gif; problemas_condicoes4.png; problemas_condicoes5.png</w:t>
       </w:r>
     </w:p>
     <w:p>
@@ -894,145 +1055,7 @@
         <w:rPr>
           <w:b/>
         </w:rPr>
-        <w:t>disjunção exclusiva</w:t>
-      </w:r>
-      <w:r>
-        <w:t xml:space="preserve"> — Operação XOR, verdadeira quando duas entradas têm valores diferentes.</w:t>
-      </w:r>
-    </w:p>
-    <w:p>
-      <w:pPr/>
-      <w:r>
-        <w:rPr>
-          <w:b/>
-        </w:rPr>
-        <w:t xml:space="preserve">Materiais: </w:t>
-      </w:r>
-      <w:r>
-        <w:t>p_xor_q.gif</w:t>
-      </w:r>
-    </w:p>
-    <w:p>
-      <w:r>
-        <w:rPr>
-          <w:b/>
-        </w:rPr>
-        <w:t>exercício didático</w:t>
-      </w:r>
-      <w:r>
-        <w:t xml:space="preserve"> — Atividade proposta para aplicar e verificar conceitos do capítulo.</w:t>
-      </w:r>
-    </w:p>
-    <w:p>
-      <w:pPr/>
-      <w:r>
-        <w:rPr>
-          <w:b/>
-        </w:rPr>
-        <w:t xml:space="preserve">Materiais: </w:t>
-      </w:r>
-      <w:r>
-        <w:t>exercicio.md</w:t>
-      </w:r>
-    </w:p>
-    <w:p>
-      <w:r>
-        <w:rPr>
-          <w:b/>
-        </w:rPr>
-        <w:t>expressão lógica</w:t>
-      </w:r>
-      <w:r>
-        <w:t xml:space="preserve"> — Composição de proposições e conectivos que produz um valor lógico.</w:t>
-      </w:r>
-    </w:p>
-    <w:p>
-      <w:pPr/>
-      <w:r>
-        <w:rPr>
-          <w:b/>
-        </w:rPr>
-        <w:t xml:space="preserve">Materiais: </w:t>
-      </w:r>
-      <w:r>
-        <w:t>problemas_condicoes3.png; problemas_condicoes4.png; problemas_condicoes5.png</w:t>
-      </w:r>
-    </w:p>
-    <w:p>
-      <w:r>
-        <w:rPr>
-          <w:b/>
-        </w:rPr>
-        <w:t>gabarito</w:t>
-      </w:r>
-      <w:r>
-        <w:t xml:space="preserve"> — Resolução e justificativa das respostas de um exercício.</w:t>
-      </w:r>
-    </w:p>
-    <w:p>
-      <w:pPr/>
-      <w:r>
-        <w:rPr>
-          <w:b/>
-        </w:rPr>
-        <w:t xml:space="preserve">Materiais: </w:t>
-      </w:r>
-      <w:r>
-        <w:t>gabarito.md</w:t>
-      </w:r>
-    </w:p>
-    <w:p>
-      <w:r>
-        <w:rPr>
-          <w:b/>
-        </w:rPr>
-        <w:t>lógica booleana</w:t>
-      </w:r>
-      <w:r>
-        <w:t xml:space="preserve"> — Sistema de raciocínio baseado em valores verdadeiro e falso e operações lógicas.</w:t>
-      </w:r>
-    </w:p>
-    <w:p>
-      <w:pPr/>
-      <w:r>
-        <w:rPr>
-          <w:b/>
-        </w:rPr>
-        <w:t xml:space="preserve">Materiais: </w:t>
-      </w:r>
-      <w:r>
-        <w:t>logica_booleana.png</w:t>
-      </w:r>
-    </w:p>
-    <w:p>
-      <w:r>
-        <w:rPr>
-          <w:b/>
-        </w:rPr>
-        <w:t>negação</w:t>
-      </w:r>
-      <w:r>
-        <w:t xml:space="preserve"> — Operação NOT que inverte o valor lógico de uma proposição.</w:t>
-      </w:r>
-    </w:p>
-    <w:p>
-      <w:pPr/>
-      <w:r>
-        <w:rPr>
-          <w:b/>
-        </w:rPr>
-        <w:t xml:space="preserve">Materiais: </w:t>
-      </w:r>
-      <w:r>
-        <w:t>logica_booleana2.png; not_p.gif; problemas_condicoes4.png; problemas_condicoes5.png</w:t>
-      </w:r>
-    </w:p>
-    <w:p>
-      <w:r>
-        <w:rPr>
-          <w:b/>
-        </w:rPr>
-        <w:t>potência de dois</w:t>
+        <w:t xml:space="preserve">potência de dois</w:t>
       </w:r>
       <w:r>
         <w:t xml:space="preserve"> — Expressão 2ⁿ usada para contar as combinações de n proposições binárias.</w:t>
@@ -1044,10 +1067,10 @@
         <w:rPr>
           <w:b/>
         </w:rPr>
-        <w:t xml:space="preserve">Materiais: </w:t>
+        <w:t xml:space="preserve">Materiais:</w:t>
       </w:r>
       <w:r>
-        <w:t>logica_booleana3.png</w:t>
+        <w:t xml:space="preserve"> logica_booleana3.png</w:t>
       </w:r>
     </w:p>
     <w:p>
@@ -1055,7 +1078,7 @@
         <w:rPr>
           <w:b/>
         </w:rPr>
-        <w:t>problema lógico</w:t>
+        <w:t xml:space="preserve">problema lógico</w:t>
       </w:r>
       <w:r>
         <w:t xml:space="preserve"> — Situação cuja resposta pode ser determinada por condições e regras lógicas.</w:t>
@@ -1067,10 +1090,10 @@
         <w:rPr>
           <w:b/>
         </w:rPr>
-        <w:t xml:space="preserve">Materiais: </w:t>
+        <w:t xml:space="preserve">Materiais:</w:t>
       </w:r>
       <w:r>
-        <w:t>problema_condicoes.png</w:t>
+        <w:t xml:space="preserve"> problema_condicoes.png</w:t>
       </w:r>
     </w:p>
     <w:p>
@@ -1078,7 +1101,7 @@
         <w:rPr>
           <w:b/>
         </w:rPr>
-        <w:t>proposição lógica</w:t>
+        <w:t xml:space="preserve">proposição lógica</w:t>
       </w:r>
       <w:r>
         <w:t xml:space="preserve"> — Afirmação à qual se pode atribuir verdadeiro ou falso.</w:t>
@@ -1090,10 +1113,10 @@
         <w:rPr>
           <w:b/>
         </w:rPr>
-        <w:t xml:space="preserve">Materiais: </w:t>
+        <w:t xml:space="preserve">Materiais:</w:t>
       </w:r>
       <w:r>
-        <w:t>logica_booleana.png; logica_booleana2.png; logica_booleana3.png; not_p.gif; problema_condicoes.png; problemas_condicoes2.png; problemas_condicoes3.png; exercicio.md; gabarito.md</w:t>
+        <w:t xml:space="preserve"> exercicio.md; gabarito.md; logica_booleana.png; logica_booleana2.png; logica_booleana3.png; not_p.gif; problema_condicoes.png; problemas_condicoes2.png; problemas_condicoes3.png</w:t>
       </w:r>
     </w:p>
     <w:p>
@@ -1101,7 +1124,7 @@
         <w:rPr>
           <w:b/>
         </w:rPr>
-        <w:t>representação binária</w:t>
+        <w:t xml:space="preserve">representação binária</w:t>
       </w:r>
       <w:r>
         <w:t xml:space="preserve"> — Uso de dois símbolos, aqui 0 e 1, para representar estados lógicos.</w:t>
@@ -1113,10 +1136,10 @@
         <w:rPr>
           <w:b/>
         </w:rPr>
-        <w:t xml:space="preserve">Materiais: </w:t>
+        <w:t xml:space="preserve">Materiais:</w:t>
       </w:r>
       <w:r>
-        <w:t>logica_booleana.png</w:t>
+        <w:t xml:space="preserve"> logica_booleana.png</w:t>
       </w:r>
     </w:p>
     <w:p>
@@ -1124,7 +1147,7 @@
         <w:rPr>
           <w:b/>
         </w:rPr>
-        <w:t>tabela-verdade</w:t>
+        <w:t xml:space="preserve">tabela-verdade</w:t>
       </w:r>
       <w:r>
         <w:t xml:space="preserve"> — Tabela que enumera entradas possíveis e o resultado de uma expressão lógica.</w:t>
@@ -1136,10 +1159,10 @@
         <w:rPr>
           <w:b/>
         </w:rPr>
-        <w:t xml:space="preserve">Materiais: </w:t>
+        <w:t xml:space="preserve">Materiais:</w:t>
       </w:r>
       <w:r>
-        <w:t>logica_booleana.png; logica_booleana2.png; logica_booleana3.png; problemas_condicoes2.png; problemas_condicoes3.png; problemas_condicoes4.png; problemas_condicoes5.png; exercicio.md; gabarito.md</w:t>
+        <w:t xml:space="preserve"> exercicio.md; gabarito.md; logica_booleana.png; logica_booleana2.png; logica_booleana3.png; problemas_condicoes2.png; problemas_condicoes3.png; problemas_condicoes4.png; problemas_condicoes5.png</w:t>
       </w:r>
     </w:p>
     <w:p>
@@ -1147,7 +1170,7 @@
         <w:rPr>
           <w:b/>
         </w:rPr>
-        <w:t>tomada de decisão</w:t>
+        <w:t xml:space="preserve">tomada de decisão</w:t>
       </w:r>
       <w:r>
         <w:t xml:space="preserve"> — Determinação de um resultado a partir de condições avaliadas.</w:t>
@@ -1159,10 +1182,10 @@
         <w:rPr>
           <w:b/>
         </w:rPr>
-        <w:t xml:space="preserve">Materiais: </w:t>
+        <w:t xml:space="preserve">Materiais:</w:t>
       </w:r>
       <w:r>
-        <w:t>problema_condicoes.png; problemas_condicoes2.png; problemas_condicoes5.png</w:t>
+        <w:t xml:space="preserve"> problema_condicoes.png; problemas_condicoes2.png; problemas_condicoes5.png</w:t>
       </w:r>
     </w:p>
     <w:p>
@@ -1170,7 +1193,7 @@
         <w:rPr>
           <w:b/>
         </w:rPr>
-        <w:t>valor lógico</w:t>
+        <w:t xml:space="preserve">valor lógico</w:t>
       </w:r>
       <w:r>
         <w:t xml:space="preserve"> — Valor verdadeiro/falso, representável por 1/0 no material.</w:t>
@@ -1182,33 +1205,10 @@
         <w:rPr>
           <w:b/>
         </w:rPr>
-        <w:t xml:space="preserve">Materiais: </w:t>
+        <w:t xml:space="preserve">Materiais:</w:t>
       </w:r>
       <w:r>
-        <w:t>logica_booleana.png; logica_booleana2.png; not_p.gif; p_and_q.gif; p_or_q.gif; p_xor_q.gif; problemas_condicoes2.png</w:t>
-      </w:r>
-    </w:p>
-    <w:p>
-      <w:r>
-        <w:rPr>
-          <w:b/>
-        </w:rPr>
-        <w:t>árvore de possibilidades</w:t>
-      </w:r>
-      <w:r>
-        <w:t xml:space="preserve"> — Representação ramificada das alternativas de valores de entrada.</w:t>
-      </w:r>
-    </w:p>
-    <w:p>
-      <w:pPr/>
-      <w:r>
-        <w:rPr>
-          <w:b/>
-        </w:rPr>
-        <w:t xml:space="preserve">Materiais: </w:t>
-      </w:r>
-      <w:r>
-        <w:t>logica_booleana3.png</w:t>
+        <w:t xml:space="preserve"> logica_booleana.png; logica_booleana2.png; not_p.gif; p_and_q.gif; p_or_q.gif; p_xor_q.gif; problemas_condicoes2.png</w:t>
       </w:r>
     </w:p>
     <w:sectPr>

</xml_diff>

<commit_message>
editorial curadoria e outros
Adicionado começo do motor de roteirizacao e edição atrelado a curatela
</commit_message>
<xml_diff>
--- a/01_Logica_e_Raciocinio/01_Catalogo_Semantico.docx
+++ b/01_Logica_e_Raciocinio/01_Catalogo_Semantico.docx
@@ -226,6 +226,15 @@
       </w:r>
     </w:p>
     <w:p>
+      <w:pPr/>
+      <w:r>
+        <w:rPr>
+          <w:sz w:val="18"/>
+        </w:rPr>
+        <w:t>Referências visuais verificadas: diagrama animado P → NOT → R; quadros na ordem P=0/R=1 e P=1/R=0, com 3 s por quadro (6 s no ciclo). Não apresenta tabela-verdade tabular.</w:t>
+      </w:r>
+    </w:p>
+    <w:p>
       <w:r>
         <w:rPr>
           <w:b/>
@@ -275,6 +284,15 @@
       </w:r>
       <w:r>
         <w:t>A animação altera os valores nas caixas de entrada e saída, permitindo observar os casos 00, 01, 10 e 11.</w:t>
+      </w:r>
+    </w:p>
+    <w:p>
+      <w:pPr/>
+      <w:r>
+        <w:rPr>
+          <w:sz w:val="18"/>
+        </w:rPr>
+        <w:t>Referências visuais verificadas: diagrama animado com entradas P/Q, bloco AND e saída R; sequência (P,Q→R): 00→0, 01→0, 10→0, 11→1; 3 s por quadro (12 s no ciclo). Não apresenta tabela-verdade tabular.</w:t>
       </w:r>
     </w:p>
     <w:p>
@@ -330,6 +348,15 @@
       </w:r>
     </w:p>
     <w:p>
+      <w:pPr/>
+      <w:r>
+        <w:rPr>
+          <w:sz w:val="18"/>
+        </w:rPr>
+        <w:t>Referências visuais verificadas: diagrama animado com entradas P/Q, bloco OR e saída R; sequência (P,Q→R): 00→0, 01→1, 10→1, 11→1; 3 s por quadro (12 s no ciclo). Não apresenta tabela-verdade tabular.</w:t>
+      </w:r>
+    </w:p>
+    <w:p>
       <w:r>
         <w:rPr>
           <w:b/>
@@ -379,6 +406,15 @@
       </w:r>
       <w:r>
         <w:t>Percorre as quatro combinações e contrasta os casos de igualdade e diferença entre os valores de entrada.</w:t>
+      </w:r>
+    </w:p>
+    <w:p>
+      <w:pPr/>
+      <w:r>
+        <w:rPr>
+          <w:sz w:val="18"/>
+        </w:rPr>
+        <w:t>Referências visuais verificadas: diagrama animado com entradas P/Q, bloco XOR e saída R; sequência (P,Q→R): 00→0, 01→1, 10→1, 11→0; 3 s por quadro (12 s no ciclo). Não apresenta tabela-verdade tabular.</w:t>
       </w:r>
     </w:p>
     <w:p>

</xml_diff>